<commit_message>
Repo reorganisation, example function and DESCRIPTION
</commit_message>
<xml_diff>
--- a/docs/analysis_plan.docx
+++ b/docs/analysis_plan.docx
@@ -48,7 +48,7 @@
         <w:pStyle w:val="BodyText"/>
       </w:pPr>
       <w:r>
-        <w:t xml:space="preserve">This document outlines the analysis plan for developing a structured approach to integrating multiple behavioural data streams (contact surveys, mobility etc) to better explain and forecast changes in transmission during respiratory outbreaks. We emphasise inference and comparing the utility of different ad-hoc behavioural data streams. Future directions intend to integrate further sources including transport and restaurant booking data, alongside social survey data capturing attitudes and NPI preferences to capture what drives these behaviours and how they influence epidemic outcomes.</w:t>
+        <w:t xml:space="preserve">This document outlines the analysis plan for developing a structured approach to integrating multiple behavioural data streams (contact surveys, mobility etc) to better explain and forecast changes in transmission during respiratory outbreaks. Our nominated streams, namely CoMix and Google Mobility, serve as proxies for transmission-relevant behaviours and are frequently used to parameterise outbreak models due to their correlation with transmission and relevance to spatial intervention. We focus on their ability to capture transmission changes and failure nodes. Future directions intend to integrate further sources including transport and restaurant booking data, alongside social survey data capturing attitudes and NPI preferences to capture what drives these behaviours and how they influence epidemic outcomes.</w:t>
       </w:r>
     </w:p>
     <w:bookmarkStart w:id="20" w:name="need"/>
@@ -65,7 +65,7 @@
         <w:pStyle w:val="FirstParagraph"/>
       </w:pPr>
       <w:r>
-        <w:t xml:space="preserve">Real-time awareness relies on understanding how behaviour and attitude changes translate into transmission change. Models often rely on single proxies / behaviour metrics or assume constant contact mixing. This obscures behavioural drivers and limits real-time understanding of transmission needed for public health decision making. Notably, age- and setting-based information is understood to enhance understanding of transmission and intervention response.</w:t>
+        <w:t xml:space="preserve">Real-time awareness relies on understanding how behaviour and attitude changes translate into transmission change. Models often rely on single behaviour metrics or assume constant contact mixing, which may overlook signals which exist in more diverse data streams. This obscures behavioural drivers and limits real-time understanding of transmission needed for public health decision making. Notably, the effectiveness of non-pharmaceutical interventions depends on how well they target settings which drive transmission and avoid disproportionately impacting low-risk groups.</w:t>
       </w:r>
     </w:p>
     <w:p>
@@ -73,7 +73,7 @@
         <w:pStyle w:val="BodyText"/>
       </w:pPr>
       <w:r>
-        <w:t xml:space="preserve">Regarding pandemic preparedness, it is important to understand what lies at the intersection between behaviour relevant to transmission, and what is policy-amenable. Identifying data sources which address this can help prioritise efforts during future outbreaks.</w:t>
+        <w:t xml:space="preserve">Regarding pandemic preparedness, it is important to understand societal response to interventions and the subsequent impact on transmission. In particular, targeting policy-amenable behaviour which is driving transmission helps reduce transmission, although this requires an understanding of which behaviours drive risk and why subgroups respond differently. This understanding can aid understanding of which data collection to prioritise and how to design policy interventions during future respiratory outbreaks.</w:t>
       </w:r>
     </w:p>
     <w:bookmarkEnd w:id="20"/>
@@ -161,7 +161,7 @@
         <w:t xml:space="preserve"> </w:t>
       </w:r>
       <w:r>
-        <w:t xml:space="preserve">datasets, overlooking what was available on a given date.</w:t>
+        <w:t xml:space="preserve">datasets. While this allows a more thorough understanding of transmission, it overlooks what was available at the time, including decisions about the selection and utility of data streams to understand transmission during an outbreak..</w:t>
       </w:r>
     </w:p>
     <w:bookmarkEnd w:id="21"/>
@@ -195,7 +195,7 @@
         </w:numPr>
       </w:pPr>
       <w:r>
-        <w:t xml:space="preserve">Fit regression models of incidence using different combinations of behavioural data streams as covariates. Evaluate the improvement in explanatory power and short-term forecast accuracy relative to a baselone model using past incidence alone.</w:t>
+        <w:t xml:space="preserve">Fit renewal-based regression models to incidence data with different combinations of behavioural data streams as covariates. Decompose R(t), embedded into the framework, into an interpretable combination of behavioural indicators to capture relative contribution. Evaluate improvement in explanatory power and short-term forecast accuracy relative to a baseline model using past incidence alone.</w:t>
       </w:r>
     </w:p>
     <w:p>
@@ -207,12 +207,12 @@
         </w:numPr>
       </w:pPr>
       <w:r>
-        <w:t xml:space="preserve">Use stratified analyses to identify over which age groups and pandemic periods changes in transmission are poorly explained/captured by the behavioural data streams used. This motivates deeper investigation into transmission-relevant mechanisms in subsequent work.</w:t>
+        <w:t xml:space="preserve">Use stratified analyses to identify over which age groups and pandemic periods changes in transmission are poorly explained by the behavioural data streams used. This will help generate hypothesis around unmeasured drivers of transmission such as immunity heterogeneity, behaviour not captured by nominated streams, or surveillance artefacts including changes to reporting.</w:t>
       </w:r>
     </w:p>
     <w:bookmarkEnd w:id="22"/>
     <w:bookmarkEnd w:id="23"/>
-    <w:bookmarkStart w:id="30" w:name="methods"/>
+    <w:bookmarkStart w:id="31" w:name="methods"/>
     <w:p>
       <w:pPr>
         <w:pStyle w:val="Heading1"/>
@@ -248,7 +248,7 @@
         <w:t xml:space="preserve"> </w:t>
       </w:r>
       <w:r>
-        <w:t xml:space="preserve">SARS-CoV-2 infection incidence estimated from the ONS COVID-19 Infection Survey (CIS) prevalence data (April 2020-2022) via the</w:t>
+        <w:t xml:space="preserve">SARS-CoV-2 infection incience estimates from the ONS COVID-19 Infection Survey (CIS) prevalence data (April 2020-2022) via the</w:t>
       </w:r>
       <w:r>
         <w:t xml:space="preserve"> </w:t>
@@ -263,19 +263,7 @@
         <w:t xml:space="preserve"> </w:t>
       </w:r>
       <w:r>
-        <w:t xml:space="preserve">package, avoiding right censoring issues when used retrospectively. Note an approximate 2-3 week publication lag with ONS data, and that pre-April 2020 cases are not captured.</w:t>
-      </w:r>
-    </w:p>
-    <w:p>
-      <w:pPr>
-        <w:pStyle w:val="Compact"/>
-        <w:numPr>
-          <w:ilvl w:val="1"/>
-          <w:numId w:val="1004"/>
-        </w:numPr>
-      </w:pPr>
-      <w:r>
-        <w:t xml:space="preserve">Age-stratified incidence is available in 5- or 10-year age bands and will be used for subgroup analyses. Age-stratified antibody prevalence from the same ONS CIS survey will be used to account for immunity when constructing the next-generation matrix. Omitting this would conflate behaviour- and immunity-driven changes in</w:t>
+        <w:t xml:space="preserve">package. CIS provides weekly national estimates with regional breakdowns across nine English regions and age stratification in 5- or 10-year bands. Note an approximate 2-3 week publication lag with ONS data, and that pre-April 2020 cases are not captured. ONS-derived antibody prevalence will be used when constructing the next-generation matrix (see Analysis Workflow) to mitigate conflating behaviour- and immunity-driven changes in</w:t>
       </w:r>
       <w:r>
         <w:t xml:space="preserve"> </w:t>
@@ -294,6 +282,9 @@
           </m:sub>
         </m:sSub>
       </m:oMath>
+      <w:r>
+        <w:t xml:space="preserve">.</w:t>
+      </w:r>
     </w:p>
     <w:p>
       <w:pPr>
@@ -318,7 +309,7 @@
         </w:numPr>
       </w:pPr>
       <w:r>
-        <w:t xml:space="preserve">CoMix: Social contact surveys conducted periodically during the pandemic. Age-stratified (5-year bands), setting-based (home, work, other), across 6 sub-regions of England, alongside NPI preferences. Available weekly, with contacts reflecting the day prior to reporting.</w:t>
+        <w:t xml:space="preserve">CoMix: Social contact surveys conducted periodically during the pandemic. Age-stratified (0-4, 5-9, 10-14,…), setting-based (home, work, other), across 6 sub-regions of England, alongside NPI preferences. Available weekly, with contacts reflecting the day prior to reporting and often a 1-2 week delay in data becoming available for analysis.</w:t>
       </w:r>
     </w:p>
     <w:p>
@@ -329,7 +320,7 @@
         </w:numPr>
       </w:pPr>
       <w:r>
-        <w:t xml:space="preserve">Google Mobility: relative spatial movements, % change in time spent relative to baseline (Jan 3rd-Feb 6th 2020). Six spatial categories, at national, regional and local level. Daily resolution, with 2-3 day reporting lag.</w:t>
+        <w:t xml:space="preserve">Google Mobility: Captures spatial movements, including change in the amount of time spent in and visits to each of six categories - Parks, Groceries, Retail and Recreation, Transit Stations, Workplaces, Residential - relative to the same day of the week during baseline Jan 3rd-Feb 6th 2020 period. Data available at national, regional and local level with daily resolution and a 2-3 day lag between reporting and availability.</w:t>
       </w:r>
     </w:p>
     <w:p>
@@ -361,7 +352,19 @@
         <w:t xml:space="preserve"> </w:t>
       </w:r>
       <w:r>
-        <w:t xml:space="preserve">After establishing systematic frameworks with the above, we have a subset of OpenTable (restaurant booking) and CityMapper (transport volume) time series from 2020-2021, which are still used among hospitality and transport industries and capture spatial movements which may explain geographical variation in transmission.</w:t>
+        <w:t xml:space="preserve">We will begin with systematic integration of CoMix, Google Mobility and OxCGRT. Other behavioural proxy data was routinely collected throughout 2020-2022, including restaurant booking volumes (OpenTable) and transport volumes in London (CityMapper). Archives of some of these data streams are available, albeit limited in the public domain such that they may be incomplete or not spanning the full 2020-2022 period. Despite this, we may explore their use as retrospective</w:t>
+      </w:r>
+      <w:r>
+        <w:t xml:space="preserve"> </w:t>
+      </w:r>
+      <w:r>
+        <w:t xml:space="preserve">“final”</w:t>
+      </w:r>
+      <w:r>
+        <w:t xml:space="preserve"> </w:t>
+      </w:r>
+      <w:r>
+        <w:t xml:space="preserve">datasets alongside our prioritised data streams to assess their utility in explaining residual changes in transmission.</w:t>
       </w:r>
     </w:p>
     <w:p>
@@ -380,6 +383,46 @@
       </w:pPr>
       <w:r>
         <w:t xml:space="preserve">Analysis workflow</w:t>
+      </w:r>
+    </w:p>
+    <w:p>
+      <w:pPr>
+        <w:pStyle w:val="Compact"/>
+        <w:numPr>
+          <w:ilvl w:val="0"/>
+          <w:numId w:val="1004"/>
+        </w:numPr>
+      </w:pPr>
+      <w:r>
+        <w:rPr>
+          <w:b/>
+          <w:bCs/>
+        </w:rPr>
+        <w:t xml:space="preserve">Harmonisation:</w:t>
+      </w:r>
+      <w:r>
+        <w:t xml:space="preserve"> </w:t>
+      </w:r>
+      <w:r>
+        <w:t xml:space="preserve">Temporal alignment of daily and weekly series to a common weekly cadence, noting where publication lags mean that a given source would not have been available on a given date e.g. ONS CIS data being released with ~2 week delay. Behavioural covariates will be standardised (z-scored) prior to model fitting, meaning coefficients are directly comparable across streams in terms of marginal association with transmission. Raw units will be retained for EDA and interpretation. For Google Mobility, a single composite time series will be derived from the six spatial categories via a weighted average.</w:t>
+      </w:r>
+    </w:p>
+    <w:p>
+      <w:pPr>
+        <w:pStyle w:val="FirstParagraph"/>
+      </w:pPr>
+      <w:r>
+        <w:rPr>
+          <w:b/>
+          <w:bCs/>
+        </w:rPr>
+        <w:t xml:space="preserve">To discuss</w:t>
+      </w:r>
+      <w:r>
+        <w:t xml:space="preserve"> </w:t>
+      </w:r>
+      <w:r>
+        <w:t xml:space="preserve">Weekly or daily resolution, and either aggregation method (daily to weekly) or interpolation (weekly to daily).</w:t>
       </w:r>
     </w:p>
     <w:p>
@@ -390,18 +433,90 @@
           <w:numId w:val="1005"/>
         </w:numPr>
       </w:pPr>
+      <m:oMath>
+        <m:sSub>
+          <m:e>
+            <m:r>
+              <m:t>R</m:t>
+            </m:r>
+          </m:e>
+          <m:sub>
+            <m:r>
+              <m:t>t</m:t>
+            </m:r>
+          </m:sub>
+        </m:sSub>
+      </m:oMath>
+      <w:r>
+        <w:t xml:space="preserve"> </w:t>
+      </w:r>
       <w:r>
         <w:rPr>
           <w:b/>
           <w:bCs/>
         </w:rPr>
-        <w:t xml:space="preserve">Harmonisation:</w:t>
-      </w:r>
-      <w:r>
-        <w:t xml:space="preserve"> </w:t>
-      </w:r>
-      <w:r>
-        <w:t xml:space="preserve">Temporal alignment of daily and weekly series to a common weekly cadence, noting where publication lags mean that a given source would not have been available on a given date e.g. ONS CIS data being released with ~2 week delay. Indicators will be standardised where necessary to reflect relative change, while retraining raw units for interpretability.</w:t>
+        <w:t xml:space="preserve">estimation:</w:t>
+      </w:r>
+      <w:r>
+        <w:t xml:space="preserve"> </w:t>
+      </w:r>
+      <m:oMath>
+        <m:sSub>
+          <m:e>
+            <m:r>
+              <m:t>R</m:t>
+            </m:r>
+          </m:e>
+          <m:sub>
+            <m:r>
+              <m:t>t</m:t>
+            </m:r>
+          </m:sub>
+        </m:sSub>
+      </m:oMath>
+      <w:r>
+        <w:t xml:space="preserve"> </w:t>
+      </w:r>
+      <w:r>
+        <w:t xml:space="preserve">estimates will be obtained from the</w:t>
+      </w:r>
+      <w:r>
+        <w:t xml:space="preserve"> </w:t>
+      </w:r>
+      <w:r>
+        <w:rPr>
+          <w:rStyle w:val="VerbatimChar"/>
+        </w:rPr>
+        <w:t xml:space="preserve">{inc2prev}</w:t>
+      </w:r>
+      <w:r>
+        <w:t xml:space="preserve"> </w:t>
+      </w:r>
+      <w:r>
+        <w:t xml:space="preserve">package, which infers instantaneous growth rate from ONS CIS prevalence data. As a first pass, use the posterior mean however the uncertainty can later be propagated throughout EDA and analysis steps.</w:t>
+      </w:r>
+      <w:r>
+        <w:t xml:space="preserve"> </w:t>
+      </w:r>
+      <m:oMath>
+        <m:sSub>
+          <m:e>
+            <m:r>
+              <m:t>R</m:t>
+            </m:r>
+          </m:e>
+          <m:sub>
+            <m:r>
+              <m:t>t</m:t>
+            </m:r>
+          </m:sub>
+        </m:sSub>
+      </m:oMath>
+      <w:r>
+        <w:t xml:space="preserve"> </w:t>
+      </w:r>
+      <w:r>
+        <w:t xml:space="preserve">is used in exploratory analysis (see below), whereas incidence in the primary outcome of regression models.</w:t>
       </w:r>
     </w:p>
     <w:p>
@@ -412,29 +527,18 @@
           <w:numId w:val="1005"/>
         </w:numPr>
       </w:pPr>
-      <m:oMath>
-        <m:sSub>
-          <m:e>
-            <m:r>
-              <m:t>R</m:t>
-            </m:r>
-          </m:e>
-          <m:sub>
-            <m:r>
-              <m:t>t</m:t>
-            </m:r>
-          </m:sub>
-        </m:sSub>
-      </m:oMath>
-      <w:r>
-        <w:t xml:space="preserve"> </w:t>
-      </w:r>
       <w:r>
         <w:rPr>
           <w:b/>
           <w:bCs/>
         </w:rPr>
-        <w:t xml:space="preserve">estimation:</w:t>
+        <w:t xml:space="preserve">Exploratory analysis:</w:t>
+      </w:r>
+      <w:r>
+        <w:t xml:space="preserve"> </w:t>
+      </w:r>
+      <w:r>
+        <w:t xml:space="preserve">Examine relationship between behavioural indicators and</w:t>
       </w:r>
       <w:r>
         <w:t xml:space="preserve"> </w:t>
@@ -454,13 +558,86 @@
         </m:sSub>
       </m:oMath>
       <w:r>
-        <w:t xml:space="preserve"> </w:t>
-      </w:r>
-      <w:r>
-        <w:t xml:space="preserve">estimates will be obtained from the</w:t>
-      </w:r>
-      <w:r>
-        <w:t xml:space="preserve"> </w:t>
+        <w:t xml:space="preserve">, starting with cross-correlation functions (CCF) over lags of -4 to +4 weeks, stratified by pandemic period, since behaviour-transmission associations vary across NPI and immunity context.</w:t>
+      </w:r>
+    </w:p>
+    <w:p>
+      <w:pPr>
+        <w:pStyle w:val="Compact"/>
+        <w:numPr>
+          <w:ilvl w:val="1"/>
+          <w:numId w:val="1006"/>
+        </w:numPr>
+      </w:pPr>
+      <w:r>
+        <w:t xml:space="preserve">Consistently significant lags will inform fixed lag choices in the regression step. PCA and Variance Inflation Factors (VIF&gt;10 threshold) will screen for multicollinearity, particularly across Google Mobility sub-categories which are likely to co-vary strongly.</w:t>
+      </w:r>
+    </w:p>
+    <w:p>
+      <w:pPr>
+        <w:pStyle w:val="Compact"/>
+        <w:numPr>
+          <w:ilvl w:val="1"/>
+          <w:numId w:val="1006"/>
+        </w:numPr>
+      </w:pPr>
+      <w:r>
+        <w:t xml:space="preserve">Contact matrices do not account for susceptibility of contacts. Using the approach outlined by Munday et al., we will use ONS-derived antibody prevalence to scale CoMix contact matrices (hereby called the</w:t>
+      </w:r>
+      <w:r>
+        <w:t xml:space="preserve"> </w:t>
+      </w:r>
+      <w:r>
+        <w:t xml:space="preserve">‘next-generation matrix’</w:t>
+      </w:r>
+      <w:r>
+        <w:t xml:space="preserve">) in line with immunity profiles at the time of survey collection. The dominant eigenvalue</w:t>
+      </w:r>
+      <w:r>
+        <w:t xml:space="preserve"> </w:t>
+      </w:r>
+      <m:oMath>
+        <m:sSub>
+          <m:e>
+            <m:r>
+              <m:t>λ</m:t>
+            </m:r>
+          </m:e>
+          <m:sub>
+            <m:r>
+              <m:t>t</m:t>
+            </m:r>
+          </m:sub>
+        </m:sSub>
+      </m:oMath>
+      <w:r>
+        <w:t xml:space="preserve"> </w:t>
+      </w:r>
+      <w:r>
+        <w:t xml:space="preserve">of each next-generation matrix provides a scalar summary of transmission potential beyond just mixing patterns. Comparing it to</w:t>
+      </w:r>
+      <w:r>
+        <w:t xml:space="preserve"> </w:t>
+      </w:r>
+      <m:oMath>
+        <m:sSub>
+          <m:e>
+            <m:r>
+              <m:t>R</m:t>
+            </m:r>
+          </m:e>
+          <m:sub>
+            <m:r>
+              <m:t>t</m:t>
+            </m:r>
+          </m:sub>
+        </m:sSub>
+      </m:oMath>
+      <w:r>
+        <w:t xml:space="preserve"> </w:t>
+      </w:r>
+      <w:r>
+        <w:t xml:space="preserve">estimates (</w:t>
       </w:r>
       <w:r>
         <w:rPr>
@@ -469,33 +646,7 @@
         <w:t xml:space="preserve">{inc2prev}</w:t>
       </w:r>
       <w:r>
-        <w:t xml:space="preserve"> </w:t>
-      </w:r>
-      <w:r>
-        <w:t xml:space="preserve">package, which infers instantaneous growth rate from ONS CIS prevalence data. As a first pass, use the posterior mean however the uncertainty can later be propagated throughout EDA and analysis steps. Sensitivity to generation interval (variant-specific) can be assessed.</w:t>
-      </w:r>
-      <w:r>
-        <w:t xml:space="preserve"> </w:t>
-      </w:r>
-      <m:oMath>
-        <m:sSub>
-          <m:e>
-            <m:r>
-              <m:t>R</m:t>
-            </m:r>
-          </m:e>
-          <m:sub>
-            <m:r>
-              <m:t>t</m:t>
-            </m:r>
-          </m:sub>
-        </m:sSub>
-      </m:oMath>
-      <w:r>
-        <w:t xml:space="preserve"> </w:t>
-      </w:r>
-      <w:r>
-        <w:t xml:space="preserve">is used in exploratory analysis (see below), whereas incidence in the primary outcome of regression models.</w:t>
+        <w:t xml:space="preserve">) tests how well CoMix tracks observed transmission.</w:t>
       </w:r>
     </w:p>
     <w:p>
@@ -511,134 +662,49 @@
           <w:b/>
           <w:bCs/>
         </w:rPr>
-        <w:t xml:space="preserve">Exploratory analysis:</w:t>
-      </w:r>
-      <w:r>
-        <w:t xml:space="preserve"> </w:t>
-      </w:r>
-      <w:r>
-        <w:t xml:space="preserve">Examine relationship between behavioural indicators and</w:t>
-      </w:r>
-      <w:r>
-        <w:t xml:space="preserve"> </w:t>
-      </w:r>
-      <m:oMath>
-        <m:sSub>
-          <m:e>
-            <m:r>
-              <m:t>R</m:t>
-            </m:r>
-          </m:e>
-          <m:sub>
-            <m:r>
-              <m:t>t</m:t>
-            </m:r>
-          </m:sub>
-        </m:sSub>
-      </m:oMath>
-      <w:r>
-        <w:t xml:space="preserve">, starting with cross-correlation functions (CCF) over lags of -4 to +4 weeks, stratified by pandemic period, since behaviour-transmission associations vary across NPI and immunity context.</w:t>
-      </w:r>
-    </w:p>
-    <w:p>
-      <w:pPr>
-        <w:pStyle w:val="Compact"/>
-        <w:numPr>
-          <w:ilvl w:val="1"/>
-          <w:numId w:val="1006"/>
-        </w:numPr>
-      </w:pPr>
-      <w:r>
-        <w:t xml:space="preserve">Consistently significant lags will inform fixed lag choices in the regression step. PCA and Variance Inflation Factors (VIF&gt;10 threshold) will screen for multicollinearity, particularly across Google Mobility sub-categories which are likely to co-vary strongly.</w:t>
-      </w:r>
-    </w:p>
-    <w:p>
-      <w:pPr>
-        <w:pStyle w:val="Compact"/>
-        <w:numPr>
-          <w:ilvl w:val="1"/>
-          <w:numId w:val="1006"/>
-        </w:numPr>
-      </w:pPr>
-      <w:r>
-        <w:t xml:space="preserve">The time-varying dominant eigenvalue</w:t>
-      </w:r>
-      <w:r>
-        <w:t xml:space="preserve"> </w:t>
-      </w:r>
-      <m:oMath>
-        <m:sSub>
-          <m:e>
-            <m:r>
-              <m:t>λ</m:t>
-            </m:r>
-          </m:e>
-          <m:sub>
-            <m:r>
-              <m:t>t</m:t>
-            </m:r>
-          </m:sub>
-        </m:sSub>
-      </m:oMath>
-      <w:r>
-        <w:t xml:space="preserve"> </w:t>
-      </w:r>
-      <w:r>
-        <w:t xml:space="preserve">of the NGM will be computed from CoMix contact matrices and ONS-derived antibody prevalence, following Munday et al. This provides a contact data informed scalar summary of transmission potenital. Comparing it to</w:t>
-      </w:r>
-      <w:r>
-        <w:t xml:space="preserve"> </w:t>
-      </w:r>
-      <m:oMath>
-        <m:sSub>
-          <m:e>
-            <m:r>
-              <m:t>R</m:t>
-            </m:r>
-          </m:e>
-          <m:sub>
-            <m:r>
-              <m:t>t</m:t>
-            </m:r>
-          </m:sub>
-        </m:sSub>
-      </m:oMath>
-      <w:r>
-        <w:t xml:space="preserve"> </w:t>
-      </w:r>
-      <w:r>
-        <w:t xml:space="preserve">estimates (</w:t>
+        <w:t xml:space="preserve">Regression framework:</w:t>
+      </w:r>
+      <w:r>
+        <w:t xml:space="preserve"> </w:t>
+      </w:r>
+      <w:r>
+        <w:t xml:space="preserve">As outlined by Nouvellet et al. in</w:t>
+      </w:r>
+      <w:r>
+        <w:t xml:space="preserve"> </w:t>
       </w:r>
       <w:r>
         <w:rPr>
           <w:rStyle w:val="VerbatimChar"/>
         </w:rPr>
-        <w:t xml:space="preserve">{inc2prev}</w:t>
-      </w:r>
-      <w:r>
-        <w:t xml:space="preserve">) tests how well CoMix tracks observed transmission.</w:t>
-      </w:r>
-    </w:p>
-    <w:p>
-      <w:pPr>
-        <w:pStyle w:val="Compact"/>
-        <w:numPr>
-          <w:ilvl w:val="0"/>
-          <w:numId w:val="1005"/>
-        </w:numPr>
-      </w:pPr>
-      <w:r>
-        <w:rPr>
-          <w:b/>
-          <w:bCs/>
-        </w:rPr>
-        <w:t xml:space="preserve">Regression framework:</w:t>
-      </w:r>
-      <w:r>
-        <w:t xml:space="preserve"> </w:t>
-      </w:r>
-      <w:r>
-        <w:t xml:space="preserve">Behavioural data streams will be used as covariates in regression models of log-incidence, with lag structure informed by EDA.</w:t>
+        <w:t xml:space="preserve">{Rtglm}</w:t>
+      </w:r>
+      <w:r>
+        <w:t xml:space="preserve">, we will use a renewal equation approach, transformed into a GAM regression model allowing us to input behavioural covariates via</w:t>
+      </w:r>
+      <w:r>
+        <w:t xml:space="preserve"> </w:t>
+      </w:r>
+      <m:oMath>
+        <m:r>
+          <m:t>R</m:t>
+        </m:r>
+        <m:d>
+          <m:dPr>
+            <m:begChr m:val="("/>
+            <m:sepChr m:val=""/>
+            <m:endChr m:val=")"/>
+            <m:grow/>
+          </m:dPr>
+          <m:e>
+            <m:r>
+              <m:t>t</m:t>
+            </m:r>
+          </m:e>
+        </m:d>
+      </m:oMath>
+      <w:r>
+        <w:t xml:space="preserve">. Lag structure will be informed via EDA.</w:t>
       </w:r>
     </w:p>
     <w:p>
@@ -660,7 +726,7 @@
         <w:t xml:space="preserve"> </w:t>
       </w:r>
       <w:r>
-        <w:t xml:space="preserve">Regress log-incidence on an autoregressive term (past incidence), representing a null hypothesis that bheavioural data adds little predictive value beyond the epidemiological signal itself.</w:t>
+        <w:t xml:space="preserve">Regress log-incidence on an autoregressive term (past incidence) alone, using a renewal-based framework. This acts as a benchmark to determine whether introducing behavioural covariates translates into meaningful improvements in model performance over epidemiological signal alone. That said, social contact data is necessary for decoupling contacts from risk and identifying which contact patterns drive transmission.</w:t>
       </w:r>
     </w:p>
     <w:p>
@@ -682,7 +748,7 @@
         <w:t xml:space="preserve"> </w:t>
       </w:r>
       <w:r>
-        <w:t xml:space="preserve">Systematically introduce CoMix, Mobility and OxCRT as covariates, individually and in combination, using GAMs/GLMs to capture nonlinearities while maintaining interpretability. Regularisation will promote coefficient stability under multicollinearity. To account for non-stationarity in behaviour-transmission relationships, models will include either period-specific interaction terms aligned with NPI periods, or time-varying coefficients.</w:t>
+        <w:t xml:space="preserve">Systematically introduce CoMix, Mobility and OxCRT as covariates, individually and in combination, using GAMs/GLMs to capture nonlinearities while maintaining interpretability. Regularisation of coefficients will promote stability under multicollinearity. To account for non-stationarity in behaviour-transmission relationships, models will include either period-specific interaction terms aligned with NPI periods, or time-varying coefficients.</w:t>
       </w:r>
     </w:p>
     <w:bookmarkEnd w:id="25"/>
@@ -718,7 +784,7 @@
         <w:t xml:space="preserve"> </w:t>
       </w:r>
       <w:r>
-        <w:t xml:space="preserve">The primary outcome is log-incidence from ONS prevalence-derived estimates. Forecasted incidence is the direct out-of-sample prediction from the fitted regression model, propagated 1-4 weeks forwards under assumptions about future behavioural inputs.</w:t>
+        <w:t xml:space="preserve">The primary outcome is log-incidence from ONS prevalence-derived estimates. Forecasted incidence is the direct out-of-sample prediction from the fitted regression model, propagated 1-4 weeks forwards under assumptions about future behavioural inputs. These incidence forecasts will be evaluated using proper scoring rules.</w:t>
       </w:r>
       <w:r>
         <w:t xml:space="preserve"> </w:t>
@@ -741,7 +807,7 @@
         <w:t xml:space="preserve"> </w:t>
       </w:r>
       <w:r>
-        <w:t xml:space="preserve">is a derived interpretative quantity used in EDA rather than regression outcomes.</w:t>
+        <w:t xml:space="preserve">is implied by the model structure rather than being a forecast target, given incidence is more tangible. Nonetheless, our evaluation of different models suggests how much of the variation in transmission each data stream accounts for.</w:t>
       </w:r>
     </w:p>
     <w:p>
@@ -759,7 +825,7 @@
         <w:t xml:space="preserve"> </w:t>
       </w:r>
       <w:r>
-        <w:t xml:space="preserve">Baseline (autoregressive), CoMix only, Mobility only, OxCGRT only, CoMix + Mobility, full model with all data streams.</w:t>
+        <w:t xml:space="preserve">Baseline (autoregressive), CoMix only, Mobility only, OxCGRT only, CoMix + Mobility, full model with all data streams. All covariates enter the model standardised, allowing direct comparison of the relataive contribution of each stream to transmission change.</w:t>
       </w:r>
     </w:p>
     <w:p>
@@ -1197,9 +1263,40 @@
             </m:rPr>
             <m:t>=</m:t>
           </m:r>
+          <m:sSub>
+            <m:e>
+              <m:r>
+                <m:t>α</m:t>
+              </m:r>
+            </m:e>
+            <m:sub>
+              <m:r>
+                <m:t>0</m:t>
+              </m:r>
+            </m:sub>
+          </m:sSub>
           <m:r>
-            <m:t>α</m:t>
+            <m:rPr>
+              <m:sty m:val="p"/>
+            </m:rPr>
+            <m:t>+</m:t>
           </m:r>
+          <m:r>
+            <m:t>s</m:t>
+          </m:r>
+          <m:d>
+            <m:dPr>
+              <m:begChr m:val="("/>
+              <m:sepChr m:val=""/>
+              <m:endChr m:val=")"/>
+              <m:grow/>
+            </m:dPr>
+            <m:e>
+              <m:r>
+                <m:t>t</m:t>
+              </m:r>
+            </m:e>
+          </m:d>
           <m:r>
             <m:rPr>
               <m:sty m:val="p"/>
@@ -1340,6 +1437,103 @@
         <m:sSub>
           <m:e>
             <m:r>
+              <m:t>α</m:t>
+            </m:r>
+          </m:e>
+          <m:sub>
+            <m:r>
+              <m:t>0</m:t>
+            </m:r>
+          </m:sub>
+        </m:sSub>
+      </m:oMath>
+      <w:r>
+        <w:t xml:space="preserve"> </w:t>
+      </w:r>
+      <w:r>
+        <w:t xml:space="preserve">is a baseline log-transmission rate and</w:t>
+      </w:r>
+      <w:r>
+        <w:t xml:space="preserve"> </w:t>
+      </w:r>
+      <m:oMath>
+        <m:r>
+          <m:t>s</m:t>
+        </m:r>
+        <m:d>
+          <m:dPr>
+            <m:begChr m:val="("/>
+            <m:sepChr m:val=""/>
+            <m:endChr m:val=")"/>
+            <m:grow/>
+          </m:dPr>
+          <m:e>
+            <m:r>
+              <m:t>t</m:t>
+            </m:r>
+          </m:e>
+        </m:d>
+      </m:oMath>
+      <w:r>
+        <w:t xml:space="preserve"> </w:t>
+      </w:r>
+      <w:r>
+        <w:t xml:space="preserve">is a spline capturing residual time variation in transmission not explained by the behavioural covariates. If the nominated streams collectively account for all systematic changes in</w:t>
+      </w:r>
+      <w:r>
+        <w:t xml:space="preserve"> </w:t>
+      </w:r>
+      <m:oMath>
+        <m:sSub>
+          <m:e>
+            <m:r>
+              <m:t>R</m:t>
+            </m:r>
+          </m:e>
+          <m:sub>
+            <m:r>
+              <m:t>t</m:t>
+            </m:r>
+          </m:sub>
+        </m:sSub>
+      </m:oMath>
+      <w:r>
+        <w:t xml:space="preserve">,</w:t>
+      </w:r>
+      <w:r>
+        <w:t xml:space="preserve"> </w:t>
+      </w:r>
+      <m:oMath>
+        <m:r>
+          <m:t>s</m:t>
+        </m:r>
+        <m:d>
+          <m:dPr>
+            <m:begChr m:val="("/>
+            <m:sepChr m:val=""/>
+            <m:endChr m:val=")"/>
+            <m:grow/>
+          </m:dPr>
+          <m:e>
+            <m:r>
+              <m:t>t</m:t>
+            </m:r>
+          </m:e>
+        </m:d>
+      </m:oMath>
+      <w:r>
+        <w:t xml:space="preserve"> </w:t>
+      </w:r>
+      <w:r>
+        <w:t xml:space="preserve">should contribute little and effectively drop out.</w:t>
+      </w:r>
+      <w:r>
+        <w:t xml:space="preserve"> </w:t>
+      </w:r>
+      <m:oMath>
+        <m:sSub>
+          <m:e>
+            <m:r>
               <m:t>β</m:t>
             </m:r>
           </m:e>
@@ -1422,8 +1616,13 @@
           </m:sub>
         </m:sSub>
       </m:oMath>
-      <w:r>
-        <w:t xml:space="preserve">. For the CoMix-informed model,</w:t>
+    </w:p>
+    <w:p>
+      <w:pPr>
+        <w:pStyle w:val="BodyText"/>
+      </w:pPr>
+      <w:r>
+        <w:t xml:space="preserve">Behavioural data streams</w:t>
       </w:r>
       <w:r>
         <w:t xml:space="preserve"> </w:t>
@@ -1432,7 +1631,7 @@
         <m:sSub>
           <m:e>
             <m:r>
-              <m:t>R</m:t>
+              <m:t>X</m:t>
             </m:r>
           </m:e>
           <m:sub>
@@ -1446,7 +1645,7 @@
         <w:t xml:space="preserve"> </w:t>
       </w:r>
       <w:r>
-        <w:t xml:space="preserve">is additionally informed by the dominant eigenvalue</w:t>
+        <w:t xml:space="preserve">include Google Mobility, OxCGRT stringency, and, for CoMix, the dominant eigenvalue</w:t>
       </w:r>
       <w:r>
         <w:t xml:space="preserve"> </w:t>
@@ -1482,199 +1681,7 @@
         <w:t xml:space="preserve"> </w:t>
       </w:r>
       <w:r>
-        <w:t xml:space="preserve">of the next-generation matrix:</w:t>
-      </w:r>
-    </w:p>
-    <w:p>
-      <w:pPr>
-        <w:pStyle w:val="BodyText"/>
-      </w:pPr>
-      <m:oMathPara>
-        <m:oMathParaPr>
-          <m:jc m:val="center"/>
-        </m:oMathParaPr>
-        <m:oMath>
-          <m:r>
-            <m:rPr>
-              <m:sty m:val="p"/>
-            </m:rPr>
-            <m:t>log</m:t>
-          </m:r>
-          <m:d>
-            <m:dPr>
-              <m:begChr m:val="("/>
-              <m:sepChr m:val=""/>
-              <m:endChr m:val=")"/>
-              <m:grow/>
-            </m:dPr>
-            <m:e>
-              <m:sSub>
-                <m:e>
-                  <m:r>
-                    <m:t>R</m:t>
-                  </m:r>
-                </m:e>
-                <m:sub>
-                  <m:r>
-                    <m:t>t</m:t>
-                  </m:r>
-                </m:sub>
-              </m:sSub>
-            </m:e>
-          </m:d>
-          <m:r>
-            <m:rPr>
-              <m:sty m:val="p"/>
-            </m:rPr>
-            <m:t>=</m:t>
-          </m:r>
-          <m:r>
-            <m:t>α</m:t>
-          </m:r>
-          <m:r>
-            <m:rPr>
-              <m:sty m:val="p"/>
-            </m:rPr>
-            <m:t>+</m:t>
-          </m:r>
-          <m:sSub>
-            <m:e>
-              <m:r>
-                <m:t>β</m:t>
-              </m:r>
-            </m:e>
-            <m:sub>
-              <m:r>
-                <m:t>λ</m:t>
-              </m:r>
-            </m:sub>
-          </m:sSub>
-          <m:sSub>
-            <m:e>
-              <m:r>
-                <m:t>λ</m:t>
-              </m:r>
-            </m:e>
-            <m:sub>
-              <m:r>
-                <m:t>1</m:t>
-              </m:r>
-            </m:sub>
-          </m:sSub>
-          <m:d>
-            <m:dPr>
-              <m:begChr m:val="("/>
-              <m:sepChr m:val=""/>
-              <m:endChr m:val=")"/>
-              <m:grow/>
-            </m:dPr>
-            <m:e>
-              <m:r>
-                <m:t>t</m:t>
-              </m:r>
-              <m:r>
-                <m:rPr>
-                  <m:sty m:val="p"/>
-                </m:rPr>
-                <m:t>−</m:t>
-              </m:r>
-              <m:r>
-                <m:rPr>
-                  <m:sty m:val="p"/>
-                </m:rPr>
-                <m:t>ℓ</m:t>
-              </m:r>
-            </m:e>
-          </m:d>
-          <m:r>
-            <m:rPr>
-              <m:sty m:val="p"/>
-            </m:rPr>
-            <m:t>+</m:t>
-          </m:r>
-          <m:nary>
-            <m:naryPr>
-              <m:chr m:val="∑"/>
-              <m:limLoc m:val="undOvr"/>
-              <m:subHide m:val="off"/>
-              <m:supHide m:val="on"/>
-            </m:naryPr>
-            <m:sub>
-              <m:r>
-                <m:t>k</m:t>
-              </m:r>
-            </m:sub>
-            <m:sup>
-              <m:r>
-                <m:t>​</m:t>
-              </m:r>
-            </m:sup>
-            <m:e>
-              <m:sSub>
-                <m:e>
-                  <m:r>
-                    <m:t>β</m:t>
-                  </m:r>
-                </m:e>
-                <m:sub>
-                  <m:r>
-                    <m:t>k</m:t>
-                  </m:r>
-                </m:sub>
-              </m:sSub>
-            </m:e>
-          </m:nary>
-          <m:sSub>
-            <m:e>
-              <m:r>
-                <m:t>X</m:t>
-              </m:r>
-            </m:e>
-            <m:sub>
-              <m:r>
-                <m:t>k</m:t>
-              </m:r>
-              <m:r>
-                <m:rPr>
-                  <m:sty m:val="p"/>
-                </m:rPr>
-                <m:t>,</m:t>
-              </m:r>
-              <m:r>
-                <m:t>t</m:t>
-              </m:r>
-              <m:r>
-                <m:rPr>
-                  <m:sty m:val="p"/>
-                </m:rPr>
-                <m:t>−</m:t>
-              </m:r>
-              <m:sSub>
-                <m:e>
-                  <m:r>
-                    <m:rPr>
-                      <m:sty m:val="p"/>
-                    </m:rPr>
-                    <m:t>ℓ</m:t>
-                  </m:r>
-                </m:e>
-                <m:sub>
-                  <m:r>
-                    <m:t>k</m:t>
-                  </m:r>
-                </m:sub>
-              </m:sSub>
-            </m:sub>
-          </m:sSub>
-        </m:oMath>
-      </m:oMathPara>
-    </w:p>
-    <w:p>
-      <w:pPr>
-        <w:pStyle w:val="FirstParagraph"/>
-      </w:pPr>
-      <w:r>
-        <w:t xml:space="preserve">where</w:t>
+        <w:t xml:space="preserve">of the next-generation matrix</w:t>
       </w:r>
       <w:r>
         <w:t xml:space="preserve"> </w:t>
@@ -1682,6 +1689,12 @@
       <m:oMath>
         <m:r>
           <m:t>N</m:t>
+        </m:r>
+        <m:r>
+          <m:t>G</m:t>
+        </m:r>
+        <m:r>
+          <m:t>M</m:t>
         </m:r>
         <m:d>
           <m:dPr>
@@ -1780,7 +1793,10 @@
         </m:d>
       </m:oMath>
       <w:r>
-        <w:t xml:space="preserve">, with</w:t>
+        <w:t xml:space="preserve"> </w:t>
+      </w:r>
+      <w:r>
+        <w:t xml:space="preserve">where</w:t>
       </w:r>
       <w:r>
         <w:t xml:space="preserve"> </w:t>
@@ -1807,7 +1823,7 @@
         <w:t xml:space="preserve"> </w:t>
       </w:r>
       <w:r>
-        <w:t xml:space="preserve">the CoMix contact matrix,</w:t>
+        <w:t xml:space="preserve">is the CoMix contact matrix,</w:t>
       </w:r>
       <w:r>
         <w:t xml:space="preserve"> </w:t>
@@ -1849,7 +1865,61 @@
         <w:t xml:space="preserve"> </w:t>
       </w:r>
       <w:r>
-        <w:t xml:space="preserve">age-specific infectiousness (following Munday et al., 2023). Distribution (Poisson, negative binomial) will be confirmed based on properties of the incidence data.</w:t>
+        <w:t xml:space="preserve">age-specific infectiousness (following Munday et al., 2023). Using</w:t>
+      </w:r>
+      <w:r>
+        <w:t xml:space="preserve"> </w:t>
+      </w:r>
+      <m:oMath>
+        <m:sSub>
+          <m:e>
+            <m:r>
+              <m:t>λ</m:t>
+            </m:r>
+          </m:e>
+          <m:sub>
+            <m:r>
+              <m:t>1</m:t>
+            </m:r>
+          </m:sub>
+        </m:sSub>
+        <m:d>
+          <m:dPr>
+            <m:begChr m:val="("/>
+            <m:sepChr m:val=""/>
+            <m:endChr m:val=")"/>
+            <m:grow/>
+          </m:dPr>
+          <m:e>
+            <m:r>
+              <m:t>t</m:t>
+            </m:r>
+          </m:e>
+        </m:d>
+      </m:oMath>
+      <w:r>
+        <w:t xml:space="preserve"> </w:t>
+      </w:r>
+      <w:r>
+        <w:t xml:space="preserve">as the CoMix-derived covariate reduces the contact matrix to a single scalar encoding mixing patterns and susceptibility, in a comparable format to other data streams.</w:t>
+      </w:r>
+    </w:p>
+    <w:p>
+      <w:pPr>
+        <w:pStyle w:val="BodyText"/>
+      </w:pPr>
+      <w:r>
+        <w:t xml:space="preserve">The choice of link function used in the GLM/GAM framework is Poisson by default, however alternatives may be explored e.g. Negative Binomial depending on the observed distribution of incidence.</w:t>
+      </w:r>
+      <w:r>
+        <w:t xml:space="preserve"> </w:t>
+      </w:r>
+      <w:r>
+        <w:rPr>
+          <w:b/>
+          <w:bCs/>
+        </w:rPr>
+        <w:t xml:space="preserve">Elaborate in context of e.g. EpiEstim</w:t>
       </w:r>
     </w:p>
     <w:p>
@@ -1885,7 +1955,7 @@
         <w:pStyle w:val="FirstParagraph"/>
       </w:pPr>
       <w:r>
-        <w:t xml:space="preserve">Model comparisons will prioritise explanatory value and robustness, with forecasting (sheer case prediction) as secondary focus.</w:t>
+        <w:t xml:space="preserve">Models will be fit on the full 2020-2022 study period as the primary analysis, with stratified analyses by pandemic period (broadly reflecting different variants) and age group at granularity supported by both ONS CIS and CoMix as secondary analysis. This is a pre-cursor to more granular socioeconomic stratifications planned in subsequent behavioural driver work. Pandemic periods will be defined broadly by variant emergence and key NPI transitions following established conventions (e.g. Munday et al. or Gimma et al.)</w:t>
       </w:r>
     </w:p>
     <w:p>
@@ -1926,7 +1996,7 @@
         <w:t xml:space="preserve"> </w:t>
       </w:r>
       <w:r>
-        <w:t xml:space="preserve">will quantify how much additional variance in incidence is explained by adding a given behavioural stream beyond the autoregressive baseline i.e. the incremental explanatory value of each data source over past incidence alone. This will be reported stratified by pandemic period and age group, with uncertainty quantified over rolling windows.</w:t>
+        <w:t xml:space="preserve">will quantify how much additional variance in incidence is explained by adding a given behavioural stream beyond the autoregressive baseline. This will be reported (i) overall across the full study period, and (ii) stratified by pandemic period and age group, with uncertainty quantified over rolling windows.</w:t>
       </w:r>
       <w:r>
         <w:t xml:space="preserve"> </w:t>
@@ -1965,7 +2035,7 @@
         <w:t xml:space="preserve"> </w:t>
       </w:r>
       <w:r>
-        <w:t xml:space="preserve">o.e. that compares goodness-of-fit / improvement in log-likelihood</w:t>
+        <w:t xml:space="preserve">o.e. that compares goodness-of-fit / improvement in log-likelihood. Stratified results characterise when and for whom each stream is most informative and where failure modes arise.</w:t>
       </w:r>
     </w:p>
     <w:p>
@@ -1983,7 +2053,7 @@
         <w:t xml:space="preserve"> </w:t>
       </w:r>
       <w:r>
-        <w:t xml:space="preserve">Weighted Interval Score (WIS) via</w:t>
+        <w:t xml:space="preserve">Continuous Ranked Probability Score (CRPS) via</w:t>
       </w:r>
       <w:r>
         <w:t xml:space="preserve"> </w:t>
@@ -1998,7 +2068,112 @@
         <w:t xml:space="preserve"> </w:t>
       </w:r>
       <w:r>
-        <w:t xml:space="preserve">to evaluate quantile forecasts at 1-4 week horizons, alongside bias and coverage. Forecast dates will be stratified by pandemic period. The Omicron period will likely be excluded on immunity grounds, following Munday et al. </w:t>
+        <w:t xml:space="preserve">to evaluate distributional forecasts at 1-4 week horizons, alongside bias and coverage. CRPS is preferred over WIS here as it applies to posterior trajectory samples rather than requiring defined quantile estimates, and decomposes cleanly into underprediction, overprediction and dispersion components. Forecast dates will be stratified by pandemic period. The Omicron period (predominantly 2022) will be excluded due to unprecedented immune dynamics, following Munday et al.</w:t>
+      </w:r>
+    </w:p>
+    <w:p>
+      <w:pPr>
+        <w:pStyle w:val="BodyText"/>
+      </w:pPr>
+      <w:r>
+        <w:rPr>
+          <w:b/>
+          <w:bCs/>
+        </w:rPr>
+        <w:t xml:space="preserve">Minimal data requirements:</w:t>
+      </w:r>
+      <w:r>
+        <w:t xml:space="preserve"> </w:t>
+      </w:r>
+      <w:r>
+        <w:t xml:space="preserve">AIC/BIC to identify model selection and specification which retain most of the value.</w:t>
+      </w:r>
+    </w:p>
+    <w:p>
+      <w:pPr>
+        <w:pStyle w:val="BodyText"/>
+      </w:pPr>
+      <w:r>
+        <w:rPr>
+          <w:b/>
+          <w:bCs/>
+        </w:rPr>
+        <w:t xml:space="preserve">Stratified diagnostics:</w:t>
+      </w:r>
+      <w:r>
+        <w:t xml:space="preserve"> </w:t>
+      </w:r>
+      <w:r>
+        <w:t xml:space="preserve">Model performance will be evaluated by age group at granularity supported by ONS and CoMix e.g. 5- or 10-year bands, and by pandemic period, characterising when and where inclusion of behavioural data improved fit and forecast accuracy. Residuals will be inspected for systematic deviations which may coincide with changes in testing policy, variant emergence, or NPI changes. Extension to a hierarchical model to enable a finer sociodemographic stratification during model development will be a natural next step, relating to the behavioural driver analysis in subsequent work.</w:t>
+      </w:r>
+    </w:p>
+    <w:bookmarkEnd w:id="27"/>
+    <w:bookmarkStart w:id="28" w:name="core-outcomes-targets-results"/>
+    <w:p>
+      <w:pPr>
+        <w:pStyle w:val="Heading2"/>
+      </w:pPr>
+      <w:r>
+        <w:t xml:space="preserve">Core outcomes / targets / results</w:t>
+      </w:r>
+    </w:p>
+    <w:p>
+      <w:pPr>
+        <w:pStyle w:val="FirstParagraph"/>
+      </w:pPr>
+      <w:r>
+        <w:rPr>
+          <w:b/>
+          <w:bCs/>
+        </w:rPr>
+        <w:t xml:space="preserve">Primary outcome:</w:t>
+      </w:r>
+      <w:r>
+        <w:t xml:space="preserve"> </w:t>
+      </w:r>
+      <w:r>
+        <w:t xml:space="preserve">Incremental variance in incidence explained by each behavioural data stream (partial</w:t>
+      </w:r>
+      <w:r>
+        <w:t xml:space="preserve"> </w:t>
+      </w:r>
+      <m:oMath>
+        <m:sSup>
+          <m:e>
+            <m:r>
+              <m:t>R</m:t>
+            </m:r>
+          </m:e>
+          <m:sup>
+            <m:r>
+              <m:t>2</m:t>
+            </m:r>
+          </m:sup>
+        </m:sSup>
+      </m:oMath>
+      <w:r>
+        <w:t xml:space="preserve">), stratified by period and age group.</w:t>
+      </w:r>
+    </w:p>
+    <w:p>
+      <w:pPr>
+        <w:pStyle w:val="BodyText"/>
+      </w:pPr>
+      <w:r>
+        <w:rPr>
+          <w:b/>
+          <w:bCs/>
+        </w:rPr>
+        <w:t xml:space="preserve">Secondary outcome:</w:t>
+      </w:r>
+      <w:r>
+        <w:t xml:space="preserve"> </w:t>
+      </w:r>
+      <w:r>
+        <w:t xml:space="preserve">Forecast accuracy (WIS) at 1-4 week time horizons.</w:t>
+      </w:r>
+      <w:r>
+        <w:t xml:space="preserve"> </w:t>
       </w:r>
       <w:r>
         <w:rPr>
@@ -2011,124 +2186,6 @@
         <w:t xml:space="preserve"> </w:t>
       </w:r>
       <w:r>
-        <w:t xml:space="preserve">WIS easier to decompose into spread/calibration components? CRPS applies if using fully distributional outputs (posterior draws)</w:t>
-      </w:r>
-    </w:p>
-    <w:p>
-      <w:pPr>
-        <w:pStyle w:val="BodyText"/>
-      </w:pPr>
-      <w:r>
-        <w:rPr>
-          <w:b/>
-          <w:bCs/>
-        </w:rPr>
-        <w:t xml:space="preserve">Minimal data requirements:</w:t>
-      </w:r>
-      <w:r>
-        <w:t xml:space="preserve"> </w:t>
-      </w:r>
-      <w:r>
-        <w:t xml:space="preserve">AIC/BIC to identify model selection and specification which retain most of the value.</w:t>
-      </w:r>
-    </w:p>
-    <w:p>
-      <w:pPr>
-        <w:pStyle w:val="BodyText"/>
-      </w:pPr>
-      <w:r>
-        <w:rPr>
-          <w:b/>
-          <w:bCs/>
-        </w:rPr>
-        <w:t xml:space="preserve">Stratified diagnostics:</w:t>
-      </w:r>
-      <w:r>
-        <w:t xml:space="preserve"> </w:t>
-      </w:r>
-      <w:r>
-        <w:t xml:space="preserve">Model performance will be evaluated by age group at granularity supported by ONS and CoMix e.g. 5- or 10-year bands, and by pandemic period, characterising when and where inclusion of behavioural data improved fit and forecast accuracy. Residuals will be inspected for systematic deviations which may coincide with changes in testing policy, variant emergence, or NPI changes. Extension to a hierarchical model to enable a finer sociodemographic stratification during model development will be a natural next step, relating to the behavioural driver analysis in subsequent work.</w:t>
-      </w:r>
-    </w:p>
-    <w:bookmarkEnd w:id="27"/>
-    <w:bookmarkStart w:id="28" w:name="core-outcomes-targets-results"/>
-    <w:p>
-      <w:pPr>
-        <w:pStyle w:val="Heading2"/>
-      </w:pPr>
-      <w:r>
-        <w:t xml:space="preserve">Core outcomes / targets / results</w:t>
-      </w:r>
-    </w:p>
-    <w:p>
-      <w:pPr>
-        <w:pStyle w:val="FirstParagraph"/>
-      </w:pPr>
-      <w:r>
-        <w:rPr>
-          <w:b/>
-          <w:bCs/>
-        </w:rPr>
-        <w:t xml:space="preserve">Primary outcome:</w:t>
-      </w:r>
-      <w:r>
-        <w:t xml:space="preserve"> </w:t>
-      </w:r>
-      <w:r>
-        <w:t xml:space="preserve">Incremental variance in incidence explained by each behavioural data stream (partial</w:t>
-      </w:r>
-      <w:r>
-        <w:t xml:space="preserve"> </w:t>
-      </w:r>
-      <m:oMath>
-        <m:sSup>
-          <m:e>
-            <m:r>
-              <m:t>R</m:t>
-            </m:r>
-          </m:e>
-          <m:sup>
-            <m:r>
-              <m:t>2</m:t>
-            </m:r>
-          </m:sup>
-        </m:sSup>
-      </m:oMath>
-      <w:r>
-        <w:t xml:space="preserve">), stratified by period and age group.</w:t>
-      </w:r>
-    </w:p>
-    <w:p>
-      <w:pPr>
-        <w:pStyle w:val="BodyText"/>
-      </w:pPr>
-      <w:r>
-        <w:rPr>
-          <w:b/>
-          <w:bCs/>
-        </w:rPr>
-        <w:t xml:space="preserve">Secondary outcome:</w:t>
-      </w:r>
-      <w:r>
-        <w:t xml:space="preserve"> </w:t>
-      </w:r>
-      <w:r>
-        <w:t xml:space="preserve">Forecast accuracy (WIS) at 1-4 week time horizons.</w:t>
-      </w:r>
-      <w:r>
-        <w:t xml:space="preserve"> </w:t>
-      </w:r>
-      <w:r>
-        <w:rPr>
-          <w:b/>
-          <w:bCs/>
-        </w:rPr>
-        <w:t xml:space="preserve">NB:</w:t>
-      </w:r>
-      <w:r>
-        <w:t xml:space="preserve"> </w:t>
-      </w:r>
-      <w:r>
         <w:t xml:space="preserve">CRPS if used.</w:t>
       </w:r>
     </w:p>
@@ -2177,11 +2234,62 @@
         <w:t xml:space="preserve"> </w:t>
       </w:r>
       <w:r>
-        <w:t xml:space="preserve">for understanding and policymaking e.g. does introducing CoMix create meaningful enough gains to support decisions? Counterfactual analysis is an anticipated domain where behavioural data beyond the autoregressive baseline is a promising addition.</w:t>
+        <w:t xml:space="preserve">for understanding and policymaking e.g. does introducing CoMix create meaningful enough gains in predictive accuracy to facilitate decision-making? Which failure nodes, such as pandemic periods or sociodemographic groups, tell us something meaningful about drivers of transmission? Counterfactual analysis is an anticipated domain where behavioural data beyond the autoregressive baseline is a promising addition.</w:t>
       </w:r>
     </w:p>
     <w:bookmarkEnd w:id="28"/>
-    <w:bookmarkStart w:id="29" w:name="extensions-to-consider"/>
+    <w:bookmarkStart w:id="29" w:name="supplementary-work"/>
+    <w:p>
+      <w:pPr>
+        <w:pStyle w:val="Heading2"/>
+      </w:pPr>
+      <w:r>
+        <w:t xml:space="preserve">Supplementary work</w:t>
+      </w:r>
+    </w:p>
+    <w:p>
+      <w:pPr>
+        <w:pStyle w:val="FirstParagraph"/>
+      </w:pPr>
+      <w:r>
+        <w:rPr>
+          <w:b/>
+          <w:bCs/>
+        </w:rPr>
+        <w:t xml:space="preserve">Sensitivity analyses:</w:t>
+      </w:r>
+      <w:r>
+        <w:t xml:space="preserve"> </w:t>
+      </w:r>
+      <w:r>
+        <w:t xml:space="preserve">TBC: Modelling choices which may influence our conclusions, such as the method used to estimate</w:t>
+      </w:r>
+      <w:r>
+        <w:t xml:space="preserve"> </w:t>
+      </w:r>
+      <m:oMath>
+        <m:sSub>
+          <m:e>
+            <m:r>
+              <m:t>R</m:t>
+            </m:r>
+          </m:e>
+          <m:sub>
+            <m:r>
+              <m:t>t</m:t>
+            </m:r>
+          </m:sub>
+        </m:sSub>
+      </m:oMath>
+      <w:r>
+        <w:t xml:space="preserve"> </w:t>
+      </w:r>
+      <w:r>
+        <w:t xml:space="preserve">from incidence data (including serial interval and window length). Any temporal alignment and data engineering choices such as methods used to aggregate individual-level contact data and rolling average window lengths.</w:t>
+      </w:r>
+    </w:p>
+    <w:bookmarkEnd w:id="29"/>
+    <w:bookmarkStart w:id="30" w:name="extensions-to-consider"/>
     <w:p>
       <w:pPr>
         <w:pStyle w:val="Heading2"/>
@@ -2235,7 +2343,7 @@
         </w:numPr>
       </w:pPr>
       <w:r>
-        <w:t xml:space="preserve">Universal differential equations or comparable (PPL) frameworks with less rigid assumptions, whilst maintaining interpretability. Need to respect delays and lags during regression tasks.</w:t>
+        <w:t xml:space="preserve">Universal differential equations or comparable (PPL) frameworks with less rigid assumptions, whilst maintaining interpretability. Need to respect delays and lags during regression tasks. Probabilistic or hierarchical and joint modelling frameworks will allow propagation of uncertainty throughout the model, as well as directly incorporate demographics such as age into the model-fitting process, rather than post-hoc performance stratification whereby performance may be dominated by high risk or more populated subgroups.</w:t>
       </w:r>
     </w:p>
     <w:p>
@@ -2250,9 +2358,9 @@
         <w:t xml:space="preserve">Consider applications to other respiratory pathogens e.g. influenza, RSV, Ebola. Many of these have social contact data but differences in data granularity and may require alternative modelling assumptions. Consider implications for future pandemic preparedness where baseline behaviour may hvae fundamentally shifted.</w:t>
       </w:r>
     </w:p>
-    <w:bookmarkEnd w:id="29"/>
     <w:bookmarkEnd w:id="30"/>
-    <w:bookmarkStart w:id="31" w:name="references"/>
+    <w:bookmarkEnd w:id="31"/>
+    <w:bookmarkStart w:id="32" w:name="references"/>
     <w:p>
       <w:pPr>
         <w:pStyle w:val="Heading1"/>
@@ -2261,7 +2369,7 @@
         <w:t xml:space="preserve">References</w:t>
       </w:r>
     </w:p>
-    <w:bookmarkEnd w:id="31"/>
+    <w:bookmarkEnd w:id="32"/>
     <w:sectPr>
       <w:footnotePr>
         <w:numRestart w:val="eachSect"/>
@@ -2560,6 +2668,91 @@
       </w:rPr>
     </w:lvl>
   </w:abstractNum>
+  <w:abstractNum w:abstractNumId="99412">
+    <w:nsid w:val="00A99412"/>
+    <w:multiLevelType w:val="multilevel"/>
+    <w:lvl w:ilvl="0">
+      <w:start w:val="2"/>
+      <w:numFmt w:val="decimal"/>
+      <w:lvlText w:val="%1."/>
+      <w:lvlJc w:val="left"/>
+      <w:pPr>
+        <w:ind w:left="720" w:hanging="360"/>
+      </w:pPr>
+    </w:lvl>
+    <w:lvl w:ilvl="1">
+      <w:start w:val="2"/>
+      <w:numFmt w:val="decimal"/>
+      <w:lvlText w:val="%2."/>
+      <w:lvlJc w:val="left"/>
+      <w:pPr>
+        <w:ind w:left="1440" w:hanging="360"/>
+      </w:pPr>
+    </w:lvl>
+    <w:lvl w:ilvl="2">
+      <w:start w:val="2"/>
+      <w:numFmt w:val="decimal"/>
+      <w:lvlText w:val="%3."/>
+      <w:lvlJc w:val="left"/>
+      <w:pPr>
+        <w:ind w:left="2160" w:hanging="360"/>
+      </w:pPr>
+    </w:lvl>
+    <w:lvl w:ilvl="3">
+      <w:start w:val="2"/>
+      <w:numFmt w:val="decimal"/>
+      <w:lvlText w:val="%4."/>
+      <w:lvlJc w:val="left"/>
+      <w:pPr>
+        <w:ind w:left="2880" w:hanging="360"/>
+      </w:pPr>
+    </w:lvl>
+    <w:lvl w:ilvl="4">
+      <w:start w:val="2"/>
+      <w:numFmt w:val="decimal"/>
+      <w:lvlText w:val="%5."/>
+      <w:lvlJc w:val="left"/>
+      <w:pPr>
+        <w:ind w:left="3600" w:hanging="360"/>
+      </w:pPr>
+    </w:lvl>
+    <w:lvl w:ilvl="5">
+      <w:start w:val="2"/>
+      <w:numFmt w:val="decimal"/>
+      <w:lvlText w:val="%6."/>
+      <w:lvlJc w:val="left"/>
+      <w:pPr>
+        <w:ind w:left="4320" w:hanging="360"/>
+      </w:pPr>
+    </w:lvl>
+    <w:lvl w:ilvl="6">
+      <w:start w:val="2"/>
+      <w:numFmt w:val="decimal"/>
+      <w:lvlText w:val="%7."/>
+      <w:lvlJc w:val="left"/>
+      <w:pPr>
+        <w:ind w:left="5040" w:hanging="360"/>
+      </w:pPr>
+    </w:lvl>
+    <w:lvl w:ilvl="7">
+      <w:start w:val="2"/>
+      <w:numFmt w:val="decimal"/>
+      <w:lvlText w:val="%8."/>
+      <w:lvlJc w:val="left"/>
+      <w:pPr>
+        <w:ind w:left="5760" w:hanging="360"/>
+      </w:pPr>
+    </w:lvl>
+    <w:lvl w:ilvl="8">
+      <w:start w:val="2"/>
+      <w:numFmt w:val="decimal"/>
+      <w:lvlText w:val="%9."/>
+      <w:lvlJc w:val="left"/>
+      <w:pPr>
+        <w:ind w:left="6480" w:hanging="360"/>
+      </w:pPr>
+    </w:lvl>
+  </w:abstractNum>
   <w:num w:numId="1000">
     <w:abstractNumId w:val="990"/>
   </w:num>
@@ -2627,9 +2820,6 @@
     <w:abstractNumId w:val="991"/>
   </w:num>
   <w:num w:numId="1004">
-    <w:abstractNumId w:val="991"/>
-  </w:num>
-  <w:num w:numId="1005">
     <w:abstractNumId w:val="99411"/>
     <w:lvlOverride w:ilvl="0">
       <w:startOverride w:val="1"/>
@@ -2657,6 +2847,36 @@
     </w:lvlOverride>
     <w:lvlOverride w:ilvl="8">
       <w:startOverride w:val="1"/>
+    </w:lvlOverride>
+  </w:num>
+  <w:num w:numId="1005">
+    <w:abstractNumId w:val="99412"/>
+    <w:lvlOverride w:ilvl="0">
+      <w:startOverride w:val="2"/>
+    </w:lvlOverride>
+    <w:lvlOverride w:ilvl="1">
+      <w:startOverride w:val="2"/>
+    </w:lvlOverride>
+    <w:lvlOverride w:ilvl="2">
+      <w:startOverride w:val="2"/>
+    </w:lvlOverride>
+    <w:lvlOverride w:ilvl="3">
+      <w:startOverride w:val="2"/>
+    </w:lvlOverride>
+    <w:lvlOverride w:ilvl="4">
+      <w:startOverride w:val="2"/>
+    </w:lvlOverride>
+    <w:lvlOverride w:ilvl="5">
+      <w:startOverride w:val="2"/>
+    </w:lvlOverride>
+    <w:lvlOverride w:ilvl="6">
+      <w:startOverride w:val="2"/>
+    </w:lvlOverride>
+    <w:lvlOverride w:ilvl="7">
+      <w:startOverride w:val="2"/>
+    </w:lvlOverride>
+    <w:lvlOverride w:ilvl="8">
+      <w:startOverride w:val="2"/>
     </w:lvlOverride>
   </w:num>
   <w:num w:numId="1006">

</xml_diff>